<commit_message>
acca answering-brief, opening-brief: shared cross-engine layout model (lib/*/xengine*), docx breaks every line and page as typst; params.cross_engine: gate
typst: Times New Roman 14 pt in 32.8 pt body and 16 pt single line boxes, explicit block spaces; footnotes 14 pt
(they were 0.85em) without a stray leading; court line and certificate titles centered; signature kept with the last
paragraph. docx: acca-brief.lua rewritten on docx.xengine to the typst form (it built an older EB Garamond 12 pt
form): Appendix A caption table, block quotes, signature, appendix, certificate of service, Panel footer on page 1;
docx/reference.xml replaces build-reference.sh and reference.docx. XENG-001..003 PASS on all four samples;
check.sh typst 16/0, docx 24/0 on each folder (fb-595.54.7)
</commit_message>
<xml_diff>
--- a/courts/military/army-court-of-criminal-appeals/answering-brief/usage/OUTPUT-answering-brief-2.docx
+++ b/courts/military/army-court-of-criminal-appeals/answering-brief/usage/OUTPUT-answering-brief-2.docx
@@ -4,122 +4,18 @@
   <w:body>
     <w:p>
       <w:pPr>
-        <w:pStyle w:val="Centered"/>
-      </w:pPr>
-      <w:r>
-        <w:rPr>
-          <w:b/>
-          <w:bCs/>
-        </w:rPr>
+        <w:spacing w:before="0" w:after="336" w:line="320" w:lineRule="exact"/>
+        <w:ind w:left="0" w:firstLine="0"/>
+        <w:jc w:val="center"/>
+      </w:pPr>
+      <w:r>
         <w:t xml:space="preserve">IN THE UNITED STATES ARMY COURT OF CRIMINAL APPEALS</w:t>
-      </w:r>
-    </w:p>
-    <w:p>
-      <w:pPr>
-        <w:pStyle w:val="CoverLine"/>
-        <w:spacing w:before="1728" w:after="0"/>
-      </w:pPr>
-      <w:r>
-        <w:rPr/>
-        <w:t xml:space="preserve">UNITED STATES,</w:t>
-      </w:r>
-    </w:p>
-    <w:p>
-      <w:pPr>
-        <w:pStyle w:val="CoverLine"/>
-      </w:pPr>
-      <w:r>
-        <w:rPr/>
-        <w:t xml:space="preserve">Appellee,</w:t>
-      </w:r>
-    </w:p>
-    <w:p>
-      <w:pPr>
-        <w:pStyle w:val="Centered"/>
-        <w:spacing w:before="240" w:after="0"/>
-      </w:pPr>
-      <w:r>
-        <w:rPr/>
-        <w:t xml:space="preserve">v.</w:t>
-      </w:r>
-    </w:p>
-    <w:p>
-      <w:pPr>
-        <w:pStyle w:val="CoverLine"/>
-        <w:spacing w:before="240" w:after="0"/>
-      </w:pPr>
-      <w:r>
-        <w:rPr/>
-        <w:t xml:space="preserve">Jordan R. Example,</w:t>
-      </w:r>
-    </w:p>
-    <w:p>
-      <w:pPr>
-        <w:pStyle w:val="CoverLine"/>
-      </w:pPr>
-      <w:r>
-        <w:rPr/>
-        <w:t xml:space="preserve">Private First Class</w:t>
-      </w:r>
-    </w:p>
-    <w:p>
-      <w:pPr>
-        <w:pStyle w:val="CoverLine"/>
-      </w:pPr>
-      <w:r>
-        <w:rPr/>
-        <w:t xml:space="preserve">U.S. Army,</w:t>
-      </w:r>
-    </w:p>
-    <w:p>
-      <w:pPr>
-        <w:pStyle w:val="CoverLine"/>
-      </w:pPr>
-      <w:r>
-        <w:rPr/>
-        <w:t xml:space="preserve">Appellant.</w:t>
-      </w:r>
-    </w:p>
-    <w:p>
-      <w:pPr>
-        <w:pStyle w:val="Centered"/>
-        <w:spacing w:before="1296" w:after="0"/>
-      </w:pPr>
-      <w:r>
-        <w:rPr>
-          <w:b/>
-          <w:bCs/>
-        </w:rPr>
-        <w:t xml:space="preserve">ARMY 20269999</w:t>
-      </w:r>
-    </w:p>
-    <w:p>
-      <w:pPr>
-        <w:pStyle w:val="Centered"/>
-        <w:spacing w:before="1296" w:after="0"/>
-      </w:pPr>
-      <w:r>
-        <w:rPr>
-          <w:b/>
-          <w:bCs/>
-        </w:rPr>
-        <w:t xml:space="preserve">BRIEF ON BEHALF OF THE UNITED STATES</w:t>
-      </w:r>
-    </w:p>
-    <w:p>
-      <w:pPr>
-        <w:pStyle w:val="Centered"/>
-        <w:spacing w:before="1440" w:after="2880"/>
-        <w:ind w:left="1368" w:right="1368" w:firstLine="0"/>
-      </w:pPr>
-      <w:r>
-        <w:rPr/>
-        <w:t xml:space="preserve">Tried at Fort Example, Kansas, on 2 and 3 March 2026, before a general court-martial appointed by the Commander, Example Division.</w:t>
       </w:r>
     </w:p>
     <w:tbl>
       <w:tblPr>
         <w:tblW w:w="9360" w:type="dxa"/>
+        <w:tblInd w:w="0" w:type="dxa"/>
         <w:tblBorders>
           <w:top w:val="nil"/>
           <w:left w:val="nil"/>
@@ -130,86 +26,128 @@
         </w:tblBorders>
         <w:tblLayout w:type="fixed"/>
         <w:tblCellMar>
+          <w:top w:w="0" w:type="dxa"/>
           <w:left w:w="0" w:type="dxa"/>
-          <w:right w:w="216" w:type="dxa"/>
+          <w:bottom w:w="0" w:type="dxa"/>
+          <w:right w:w="0" w:type="dxa"/>
         </w:tblCellMar>
       </w:tblPr>
       <w:tblGrid>
-        <w:gridCol w:w="4680"/>
-        <w:gridCol w:w="4680"/>
+        <w:gridCol w:w="4896.0"/>
+        <w:gridCol w:w="4464.0"/>
       </w:tblGrid>
       <w:tr>
+        <w:trPr>
+          <w:cantSplit/>
+        </w:trPr>
         <w:tc>
           <w:tcPr>
-            <w:tcW w:w="4680" w:type="dxa"/>
+            <w:tcW w:w="4896.0" w:type="dxa"/>
+            <w:tcMar>
+              <w:right w:w="432" w:type="dxa"/>
+            </w:tcMar>
           </w:tcPr>
           <w:p>
             <w:pPr>
-              <w:pStyle w:val="CoverLine"/>
+              <w:spacing w:before="0" w:after="0" w:line="320" w:lineRule="exact"/>
+              <w:ind w:left="0" w:firstLine="0"/>
             </w:pPr>
             <w:r>
-              <w:t xml:space="preserve">MAJOR TOBIAS L. SAMPLE</w:t>
+              <w:t xml:space="preserve">UNITED STATES</w:t>
             </w:r>
           </w:p>
           <w:p>
             <w:pPr>
-              <w:pStyle w:val="CoverLine"/>
+              <w:spacing w:before="56" w:after="0" w:line="320" w:lineRule="exact"/>
+              <w:ind w:left="1728" w:firstLine="0"/>
             </w:pPr>
             <w:r>
-              <w:t xml:space="preserve">Attorney-Advisor</w:t>
+              <w:t xml:space="preserve">Appellee</w:t>
             </w:r>
           </w:p>
           <w:p>
             <w:pPr>
-              <w:pStyle w:val="CoverLine"/>
+              <w:spacing w:before="280" w:after="0" w:line="320" w:lineRule="exact"/>
+              <w:ind w:left="1152" w:firstLine="0"/>
             </w:pPr>
             <w:r>
-              <w:t xml:space="preserve">Government Appellate Division</w:t>
+              <w:t xml:space="preserve">v.</w:t>
             </w:r>
           </w:p>
           <w:p>
             <w:pPr>
-              <w:pStyle w:val="CoverLine"/>
+              <w:spacing w:before="280" w:after="0" w:line="320" w:lineRule="exact"/>
+              <w:ind w:left="0" w:firstLine="0"/>
             </w:pPr>
             <w:r>
-              <w:t xml:space="preserve">U.S. Army Legal Services Agency</w:t>
+              <w:t xml:space="preserve">Private First Class</w:t>
             </w:r>
           </w:p>
           <w:p>
             <w:pPr>
-              <w:pStyle w:val="CoverLine"/>
+              <w:spacing w:before="0" w:after="0" w:line="320" w:lineRule="exact"/>
+              <w:ind w:left="0" w:firstLine="0"/>
             </w:pPr>
             <w:r>
-              <w:t xml:space="preserve">9275 Gunston Road</w:t>
+              <w:rPr>
+                <w:b/>
+                <w:bCs/>
+              </w:rPr>
+              <w:t xml:space="preserve">Jordan R. Example</w:t>
             </w:r>
           </w:p>
           <w:p>
             <w:pPr>
-              <w:pStyle w:val="CoverLine"/>
+              <w:spacing w:before="0" w:after="0" w:line="320" w:lineRule="exact"/>
+              <w:ind w:left="0" w:firstLine="0"/>
             </w:pPr>
             <w:r>
-              <w:t xml:space="preserve">Fort Belvoir, Virginia 22060</w:t>
+              <w:t xml:space="preserve">U.S. Army</w:t>
             </w:r>
           </w:p>
           <w:p>
             <w:pPr>
-              <w:pStyle w:val="CoverLine"/>
+              <w:spacing w:before="56" w:after="0" w:line="320" w:lineRule="exact"/>
+              <w:ind w:left="1728" w:firstLine="0"/>
             </w:pPr>
             <w:r>
-              <w:t xml:space="preserve">(555) 010-0202</w:t>
+              <w:t xml:space="preserve">Appellant</w:t>
             </w:r>
           </w:p>
         </w:tc>
         <w:tc>
           <w:tcPr>
-            <w:tcW w:w="4680" w:type="dxa"/>
+            <w:tcW w:w="4464.0" w:type="dxa"/>
           </w:tcPr>
           <w:p>
             <w:pPr>
-              <w:pStyle w:val="CoverLine"/>
+              <w:spacing w:before="0" w:after="0" w:line="320" w:lineRule="exact"/>
+              <w:ind w:left="0" w:firstLine="0"/>
             </w:pPr>
             <w:r>
-              <w:t xml:space="preserve">Counsel for the United States</w:t>
+              <w:rPr>
+                <w:b/>
+                <w:bCs/>
+              </w:rPr>
+              <w:t xml:space="preserve">BRIEF ON BEHALF OF APPELLEE</w:t>
+            </w:r>
+          </w:p>
+          <w:p>
+            <w:pPr>
+              <w:spacing w:before="280" w:after="0" w:line="320" w:lineRule="exact"/>
+              <w:ind w:left="0" w:firstLine="0"/>
+            </w:pPr>
+            <w:r>
+              <w:t xml:space="preserve">Docket No. ARMY 20269999</w:t>
+            </w:r>
+          </w:p>
+          <w:p>
+            <w:pPr>
+              <w:spacing w:before="280" w:after="0" w:line="320" w:lineRule="exact"/>
+              <w:ind w:left="0" w:firstLine="0"/>
+            </w:pPr>
+            <w:r>
+              <w:t xml:space="preserve">Tried at Fort Example, Kansas, on 2 and 3 March 2026, before a general court-martial appointed by the Commander, Example Division.</w:t>
             </w:r>
           </w:p>
         </w:tc>
@@ -217,27 +155,23 @@
     </w:tbl>
     <w:p>
       <w:pPr>
-        <w:spacing w:before="0" w:after="0" w:line="240" w:lineRule="auto"/>
-        <w:rPr>
-          <w:sz w:val="2"/>
-        </w:rPr>
-      </w:pPr>
-      <w:r>
-        <w:rPr>
-          <w:sz w:val="2"/>
-        </w:rPr>
-        <w:br w:type="page"/>
+        <w:spacing w:before="392" w:after="168" w:line="320" w:lineRule="exact"/>
+        <w:ind w:left="1080" w:right="1080" w:firstLine="0"/>
+        <w:jc w:val="center"/>
+      </w:pPr>
+      <w:r>
+        <w:t xml:space="preserve">TO THE HONORABLE, THE JUDGES OF THE UNITED STATES ARMY COURT OF CRIMINAL APPEALS</w:t>
       </w:r>
     </w:p>
     <w:p>
       <w:pPr>
         <w:pStyle w:val="Heading1"/>
       </w:pPr>
-      <w:bookmarkStart w:id="111" w:name="_9ce86cd89e816c495213921bce711286420babc"/>
+      <w:bookmarkStart w:id="9" w:name="_9ce86cd89e816c495213921bce711286420babc"/>
       <w:r>
         <w:t xml:space="preserve">STATEMENT OF THE CASE</w:t>
       </w:r>
-      <w:bookmarkEnd w:id="111"/>
+      <w:bookmarkEnd w:id="9"/>
     </w:p>
     <w:p>
       <w:pPr>
@@ -251,11 +185,11 @@
       <w:pPr>
         <w:pStyle w:val="Heading1"/>
       </w:pPr>
-      <w:bookmarkStart w:id="112" w:name="_c782d4980352688b0148305281d62652acab74d"/>
+      <w:bookmarkStart w:id="10" w:name="_c782d4980352688b0148305281d62652acab74d"/>
       <w:r>
         <w:t xml:space="preserve">STATEMENT OF FACTS</w:t>
       </w:r>
-      <w:bookmarkEnd w:id="112"/>
+      <w:bookmarkEnd w:id="10"/>
     </w:p>
     <w:p>
       <w:pPr>
@@ -277,31 +211,31 @@
       <w:pPr>
         <w:pStyle w:val="Heading1"/>
       </w:pPr>
-      <w:bookmarkStart w:id="113" w:name="_3e0928d92ba38a19357ed7aa703babdbdc8488f"/>
+      <w:bookmarkStart w:id="11" w:name="_3e0928d92ba38a19357ed7aa703babdbdc8488f"/>
       <w:r>
         <w:t xml:space="preserve">ERRORS AND ARGUMENT</w:t>
       </w:r>
-      <w:bookmarkEnd w:id="113"/>
+      <w:bookmarkEnd w:id="11"/>
     </w:p>
     <w:p>
       <w:pPr>
         <w:pStyle w:val="Heading2"/>
       </w:pPr>
-      <w:bookmarkStart w:id="114" w:name="_f814b47975912dc17b339b3302e9222c865e741"/>
+      <w:bookmarkStart w:id="12" w:name="_f814b47975912dc17b339b3302e9222c865e741"/>
       <w:r>
         <w:t xml:space="preserve">I. THE MILITARY JUDGE DID NOT ABUSE HIS DISCRETION IN ADMITTING THE WITNESS’S IDENTIFICATION AFTER A HEARING ON THE EVIDENCE.</w:t>
       </w:r>
-      <w:bookmarkEnd w:id="114"/>
+      <w:bookmarkEnd w:id="12"/>
     </w:p>
     <w:p>
       <w:pPr>
         <w:pStyle w:val="Heading3"/>
       </w:pPr>
-      <w:bookmarkStart w:id="115" w:name="_9339ea4a612847623b5ac5d9b950ce636f60fb0"/>
+      <w:bookmarkStart w:id="13" w:name="_9339ea4a612847623b5ac5d9b950ce636f60fb0"/>
       <w:r>
         <w:t xml:space="preserve">Standard of Review</w:t>
       </w:r>
-      <w:bookmarkEnd w:id="115"/>
+      <w:bookmarkEnd w:id="13"/>
     </w:p>
     <w:p>
       <w:pPr>
@@ -315,11 +249,11 @@
       <w:pPr>
         <w:pStyle w:val="Heading3"/>
       </w:pPr>
-      <w:bookmarkStart w:id="116" w:name="_argument"/>
+      <w:bookmarkStart w:id="14" w:name="_argument"/>
       <w:r>
         <w:t xml:space="preserve">Argument</w:t>
       </w:r>
-      <w:bookmarkEnd w:id="116"/>
+      <w:bookmarkEnd w:id="14"/>
     </w:p>
     <w:p>
       <w:pPr>
@@ -341,21 +275,21 @@
       <w:pPr>
         <w:pStyle w:val="Heading2"/>
       </w:pPr>
-      <w:bookmarkStart w:id="117" w:name="_32208941de5eb8e5563d32e30d9d7a17d20cf5f"/>
+      <w:bookmarkStart w:id="15" w:name="_32208941de5eb8e5563d32e30d9d7a17d20cf5f"/>
       <w:r>
         <w:t xml:space="preserve">II. THE EVIDENCE IS LEGALLY SUFFICIENT TO SUPPORT THE FINDING OF GUILTY TO WRONGFUL POSSESSION.</w:t>
       </w:r>
-      <w:bookmarkEnd w:id="117"/>
+      <w:bookmarkEnd w:id="15"/>
     </w:p>
     <w:p>
       <w:pPr>
         <w:pStyle w:val="Heading3"/>
       </w:pPr>
-      <w:bookmarkStart w:id="118" w:name="_9f632a0f05729562e85f90407e3e90bfa66ee98"/>
+      <w:bookmarkStart w:id="16" w:name="_9f632a0f05729562e85f90407e3e90bfa66ee98"/>
       <w:r>
         <w:t xml:space="preserve">Standard of Review</w:t>
       </w:r>
-      <w:bookmarkEnd w:id="118"/>
+      <w:bookmarkEnd w:id="16"/>
     </w:p>
     <w:p>
       <w:pPr>
@@ -369,11 +303,11 @@
       <w:pPr>
         <w:pStyle w:val="Heading3"/>
       </w:pPr>
-      <w:bookmarkStart w:id="119" w:name="_75aafa5f2d95d44f3bca9869a18011d029224a8"/>
+      <w:bookmarkStart w:id="17" w:name="_75aafa5f2d95d44f3bca9869a18011d029224a8"/>
       <w:r>
         <w:t xml:space="preserve">Argument</w:t>
       </w:r>
-      <w:bookmarkEnd w:id="119"/>
+      <w:bookmarkEnd w:id="17"/>
     </w:p>
     <w:p>
       <w:pPr>
@@ -385,7 +319,7 @@
     </w:p>
     <w:p>
       <w:pPr>
-        <w:pStyle w:val="BodyKeepNext"/>
+        <w:pStyle w:val="BodyKeep"/>
       </w:pPr>
       <w:r>
         <w:t xml:space="preserve">WHEREFORE, the United States respectfully requests that this Court affirm the findings of guilty and the sentence as approved by the convening authority.</w:t>
@@ -393,139 +327,148 @@
     </w:p>
     <w:p>
       <w:pPr>
-        <w:pStyle w:val="SigBlock"/>
         <w:keepNext/>
         <w:keepLines/>
-        <w:spacing w:before="240" w:after="0"/>
-      </w:pPr>
-      <w:r>
-        <w:rPr/>
-        <w:t xml:space="preserve">MAJOR TOBIAS L. SAMPLE, JA</w:t>
-      </w:r>
-    </w:p>
-    <w:p>
-      <w:pPr>
-        <w:pStyle w:val="SigBlock"/>
+        <w:pBdr>
+          <w:bottom w:val="single" w:sz="4" w:space="0" w:color="000000"/>
+        </w:pBdr>
+        <w:spacing w:before="672" w:after="0" w:line="120" w:lineRule="exact"/>
+        <w:ind w:left="0" w:right="5040" w:firstLine="0"/>
+      </w:pPr>
+    </w:p>
+    <w:p>
+      <w:pPr>
         <w:keepNext/>
         <w:keepLines/>
-        <w:spacing w:before="0" w:after="0"/>
-      </w:pPr>
-      <w:r>
-        <w:rPr/>
-        <w:t xml:space="preserve">Attorney-Advisor, Government Appellate Division</w:t>
-      </w:r>
-    </w:p>
-    <w:p>
-      <w:pPr>
-        <w:pStyle w:val="SigBlock"/>
+        <w:spacing w:before="0" w:after="0" w:line="320" w:lineRule="exact"/>
+        <w:ind w:left="0" w:firstLine="0"/>
+      </w:pPr>
+      <w:r>
+        <w:t xml:space="preserve">MAJOR TOBIAS L. SAMPLE, JA</w:t>
+      </w:r>
+    </w:p>
+    <w:p>
+      <w:pPr>
         <w:keepNext/>
         <w:keepLines/>
-        <w:spacing w:before="0" w:after="0"/>
-      </w:pPr>
-      <w:r>
-        <w:rPr/>
-        <w:t xml:space="preserve">U.S. Army Legal Services Agency</w:t>
-      </w:r>
-    </w:p>
-    <w:p>
-      <w:pPr>
-        <w:pStyle w:val="SigBlock"/>
+        <w:spacing w:before="0" w:after="0" w:line="320" w:lineRule="exact"/>
+        <w:ind w:left="0" w:firstLine="0"/>
+      </w:pPr>
+      <w:r>
+        <w:t xml:space="preserve">Attorney-Advisor, Government Appellate Division</w:t>
+      </w:r>
+    </w:p>
+    <w:p>
+      <w:pPr>
         <w:keepNext/>
         <w:keepLines/>
-        <w:spacing w:before="0" w:after="0"/>
-      </w:pPr>
-      <w:r>
-        <w:rPr/>
+        <w:spacing w:before="0" w:after="0" w:line="320" w:lineRule="exact"/>
+        <w:ind w:left="0" w:firstLine="0"/>
+      </w:pPr>
+      <w:r>
+        <w:t xml:space="preserve">U.S. Army Legal Services Agency</w:t>
+      </w:r>
+    </w:p>
+    <w:p>
+      <w:pPr>
+        <w:keepNext/>
+        <w:keepLines/>
+        <w:spacing w:before="0" w:after="0" w:line="320" w:lineRule="exact"/>
+        <w:ind w:left="0" w:firstLine="0"/>
+      </w:pPr>
+      <w:r>
         <w:t xml:space="preserve">9275 Gunston Road, Fort Belvoir, Virginia 22060</w:t>
       </w:r>
     </w:p>
     <w:p>
       <w:pPr>
-        <w:pStyle w:val="SigBlock"/>
-        <w:spacing w:before="0" w:after="0"/>
-      </w:pPr>
-      <w:r>
-        <w:rPr/>
-        <w:t xml:space="preserve">(555) 010-0202</w:t>
-      </w:r>
-    </w:p>
-    <w:p>
-      <w:pPr>
-        <w:spacing w:before="0" w:after="0" w:line="240" w:lineRule="auto"/>
-        <w:rPr>
-          <w:sz w:val="2"/>
-        </w:rPr>
-      </w:pPr>
-      <w:r>
-        <w:rPr>
-          <w:sz w:val="2"/>
-        </w:rPr>
-        <w:br w:type="page"/>
-      </w:r>
-    </w:p>
-    <w:p>
-      <w:pPr>
-        <w:pStyle w:val="Centered"/>
-        <w:spacing w:before="0" w:after="240"/>
+        <w:spacing w:before="0" w:after="0" w:line="320" w:lineRule="exact"/>
+        <w:ind w:left="0" w:firstLine="0"/>
+      </w:pPr>
+      <w:r>
+        <w:t xml:space="preserve">(555) 010</w:t>
+        <w:noBreakHyphen/>
+        <w:t xml:space="preserve">0202</w:t>
+      </w:r>
+    </w:p>
+    <w:p>
+      <w:pPr>
+        <w:keepNext/>
+        <w:keepLines/>
+        <w:pageBreakBefore/>
+        <w:spacing w:before="0" w:after="280" w:line="320" w:lineRule="exact"/>
+        <w:ind w:left="0" w:firstLine="0"/>
+        <w:jc w:val="center"/>
       </w:pPr>
       <w:r>
         <w:rPr>
           <w:b/>
           <w:bCs/>
         </w:rPr>
-        <w:t xml:space="preserve">CERTIFICATE OF FILING AND SERVICE</w:t>
-      </w:r>
-    </w:p>
-    <w:p>
-      <w:pPr>
-        <w:pStyle w:val="BodyText"/>
-      </w:pPr>
-      <w:r>
-        <w:t xml:space="preserve">I certify that a copy of the foregoing was mailed or delivered to the Court and to appellate defense counsel for the appellant on November 2, 2026.</w:t>
-      </w:r>
-    </w:p>
-    <w:p>
-      <w:pPr>
-        <w:pStyle w:val="SigBlock"/>
+        <w:t xml:space="preserve">Certificate of Service</w:t>
+      </w:r>
+    </w:p>
+    <w:p>
+      <w:pPr>
         <w:keepNext/>
         <w:keepLines/>
-        <w:spacing w:before="480" w:after="0"/>
-      </w:pPr>
-      <w:r>
-        <w:rPr/>
-        <w:t xml:space="preserve">MAJOR TOBIAS L. SAMPLE, JA</w:t>
-      </w:r>
-    </w:p>
-    <w:p>
-      <w:pPr>
-        <w:pStyle w:val="SigBlock"/>
+        <w:spacing w:before="0" w:after="0" w:line="656" w:lineRule="exact"/>
+        <w:ind w:left="0" w:firstLine="720"/>
+      </w:pPr>
+      <w:r>
+        <w:t xml:space="preserve">I certify that a copy of the foregoing was sent via electronic submission to the Defense Appellate Division on November 2, 2026.</w:t>
+      </w:r>
+    </w:p>
+    <w:p>
+      <w:pPr>
         <w:keepNext/>
         <w:keepLines/>
-        <w:spacing w:before="0" w:after="0"/>
-      </w:pPr>
-      <w:r>
-        <w:rPr/>
+        <w:pBdr>
+          <w:bottom w:val="single" w:sz="4" w:space="0" w:color="000000"/>
+        </w:pBdr>
+        <w:spacing w:before="672" w:after="0" w:line="120" w:lineRule="exact"/>
+        <w:ind w:left="4320" w:right="0" w:firstLine="0"/>
+      </w:pPr>
+    </w:p>
+    <w:p>
+      <w:pPr>
+        <w:keepNext/>
+        <w:keepLines/>
+        <w:spacing w:before="0" w:after="0" w:line="320" w:lineRule="exact"/>
+        <w:ind w:left="4320" w:firstLine="0"/>
+      </w:pPr>
+      <w:r>
+        <w:t xml:space="preserve">MAJOR TOBIAS L. SAMPLE, JA</w:t>
+      </w:r>
+    </w:p>
+    <w:p>
+      <w:pPr>
+        <w:keepNext/>
+        <w:keepLines/>
+        <w:spacing w:before="0" w:after="0" w:line="320" w:lineRule="exact"/>
+        <w:ind w:left="4320" w:firstLine="0"/>
+      </w:pPr>
+      <w:r>
         <w:t xml:space="preserve">Attorney-Advisor, Government Appellate Division</w:t>
       </w:r>
     </w:p>
     <w:p>
       <w:pPr>
-        <w:pStyle w:val="SigBlock"/>
-        <w:spacing w:before="0" w:after="0"/>
-      </w:pPr>
-      <w:r>
-        <w:rPr/>
-        <w:t xml:space="preserve">(555) 010-0202</w:t>
+        <w:spacing w:before="0" w:after="0" w:line="320" w:lineRule="exact"/>
+        <w:ind w:left="4320" w:firstLine="0"/>
+      </w:pPr>
+      <w:r>
+        <w:t xml:space="preserve">(555) 010</w:t>
+        <w:noBreakHyphen/>
+        <w:t xml:space="preserve">0202</w:t>
       </w:r>
     </w:p>
     <w:sectPr>
-      <w:footerReference w:type="default" r:id="rId101"/>
-      <w:footerReference w:type="first" r:id="rId102"/>
-      <w:footnotePr>
-        <w:numRestart w:val="eachSect"/>
-      </w:footnotePr>
+      <w:footerReference w:type="default" r:id="rIdAccaPage"/>
+      <w:footerReference w:type="first" r:id="rIdAccaPanel"/>
       <w:pgSz w:w="12240" w:h="15840"/>
-      <w:pgMar w:top="1440" w:right="1440" w:bottom="1440" w:left="1440" w:header="720" w:footer="720" w:gutter="0"/>
+      <w:pgMar w:top="1440" w:right="1440" w:bottom="1520" w:left="1440" w:header="720" w:footer="744" w:gutter="0"/>
+      <w:pgNumType w:fmt="decimal" w:start="1"/>
       <w:titlePg/>
     </w:sectPr>
   </w:body>
@@ -536,75 +479,130 @@
 <w:comments xmlns:w="http://schemas.openxmlformats.org/wordprocessingml/2006/main" xmlns:m="http://schemas.openxmlformats.org/officeDocument/2006/math" xmlns:r="http://schemas.openxmlformats.org/officeDocument/2006/relationships" xmlns:o="urn:schemas-microsoft-com:office:office" xmlns:v="urn:schemas-microsoft-com:vml" xmlns:w10="urn:schemas-microsoft-com:office:word" xmlns:a="http://schemas.openxmlformats.org/drawingml/2006/main" xmlns:pic="http://schemas.openxmlformats.org/drawingml/2006/picture" xmlns:wp="http://schemas.openxmlformats.org/drawingml/2006/wordprocessingDrawing"/>
 </file>
 
-<file path=word/footer1.xml><?xml version="1.0" encoding="utf-8"?>
+<file path=word/footnotes.xml><?xml version="1.0" encoding="utf-8"?>
+<w:footnotes xmlns:w="http://schemas.openxmlformats.org/wordprocessingml/2006/main" xmlns:m="http://schemas.openxmlformats.org/officeDocument/2006/math" xmlns:r="http://schemas.openxmlformats.org/officeDocument/2006/relationships" xmlns:o="urn:schemas-microsoft-com:office:office" xmlns:v="urn:schemas-microsoft-com:vml" xmlns:w10="urn:schemas-microsoft-com:office:word" xmlns:a="http://schemas.openxmlformats.org/drawingml/2006/main" xmlns:pic="http://schemas.openxmlformats.org/drawingml/2006/picture" xmlns:wp="http://schemas.openxmlformats.org/drawingml/2006/wordprocessingDrawing">
+  <w:footnote w:type="continuationSeparator" w:id="0">
+    <w:p>
+      <w:r>
+        <w:continuationSeparator/>
+      </w:r>
+    </w:p>
+  </w:footnote>
+  <w:footnote w:type="separator" w:id="-1">
+    <w:p>
+      <w:r>
+        <w:separator/>
+      </w:r>
+    </w:p>
+  </w:footnote>
+</w:footnotes>
+</file>
+
+<file path=word/ftr-add.xml><?xml version="1.0" encoding="utf-8"?>
 <w:ftr xmlns:w="http://schemas.openxmlformats.org/wordprocessingml/2006/main" xmlns:r="http://schemas.openxmlformats.org/officeDocument/2006/relationships">
   <w:p>
     <w:pPr>
-      <w:spacing w:before="0" w:after="0" w:line="240" w:lineRule="auto"/>
-      <w:ind w:firstLine="0"/>
+      <w:spacing w:before="0" w:after="0"/>
       <w:jc w:val="center"/>
     </w:pPr>
     <w:r>
-      <w:rPr>
-        <w:sz w:val="24"/>
-      </w:rPr>
+      <w:t>Add-</w:t>
+    </w:r>
+    <w:r>
       <w:fldChar w:fldCharType="begin"/>
     </w:r>
     <w:r>
-      <w:rPr>
-        <w:sz w:val="24"/>
-      </w:rPr>
       <w:instrText xml:space="preserve"> PAGE </w:instrText>
     </w:r>
     <w:r>
-      <w:rPr>
-        <w:sz w:val="24"/>
-      </w:rPr>
       <w:fldChar w:fldCharType="separate"/>
     </w:r>
     <w:r>
-      <w:rPr>
-        <w:sz w:val="24"/>
-      </w:rPr>
-      <w:t>2</w:t>
+      <w:t>1</w:t>
     </w:r>
     <w:r>
-      <w:rPr>
-        <w:sz w:val="24"/>
-      </w:rPr>
       <w:fldChar w:fldCharType="end"/>
     </w:r>
   </w:p>
 </w:ftr>
 </file>
 
-<file path=word/footer2.xml><?xml version="1.0" encoding="utf-8"?>
+<file path=word/ftr-none.xml><?xml version="1.0" encoding="utf-8"?>
 <w:ftr xmlns:w="http://schemas.openxmlformats.org/wordprocessingml/2006/main" xmlns:r="http://schemas.openxmlformats.org/officeDocument/2006/relationships">
   <w:p>
     <w:pPr>
-      <w:spacing w:before="0" w:after="0" w:line="240" w:lineRule="auto"/>
+      <w:spacing w:before="0" w:after="0"/>
+      <w:jc w:val="center"/>
     </w:pPr>
   </w:p>
 </w:ftr>
 </file>
 
-<file path=word/footnotes.xml><?xml version="1.0" encoding="utf-8"?>
-<w:footnotes xmlns:w="http://schemas.openxmlformats.org/wordprocessingml/2006/main" xmlns:m="http://schemas.openxmlformats.org/officeDocument/2006/math" xmlns:r="http://schemas.openxmlformats.org/officeDocument/2006/relationships" xmlns:o="urn:schemas-microsoft-com:office:office" xmlns:v="urn:schemas-microsoft-com:vml" xmlns:w10="urn:schemas-microsoft-com:office:word" xmlns:a="http://schemas.openxmlformats.org/drawingml/2006/main" xmlns:pic="http://schemas.openxmlformats.org/drawingml/2006/picture" xmlns:wp="http://schemas.openxmlformats.org/drawingml/2006/wordprocessingDrawing">
-  <w:footnote w:type="continuationSeparator" w:id="0">
-    <w:p>
-      <w:r>
-        <w:continuationSeparator/>
-      </w:r>
-    </w:p>
-  </w:footnote>
-  <w:footnote w:type="separator" w:id="-1">
-    <w:p>
-      <w:r>
-        <w:separator/>
-      </w:r>
-    </w:p>
-  </w:footnote>
-</w:footnotes>
+<file path=word/ftr-own1.xml><?xml version="1.0" encoding="utf-8"?>
+<w:ftr xmlns:w="http://schemas.openxmlformats.org/wordprocessingml/2006/main" xmlns:r="http://schemas.openxmlformats.org/officeDocument/2006/relationships">
+  <w:p>
+    <w:pPr>
+      <w:pStyle w:val="Footer"/>
+      <w:spacing w:before="0" w:after="0" w:line="320" w:lineRule="exact"/>
+      <w:ind w:left="0" w:firstLine="0"/>
+      <w:jc w:val="right"/>
+    </w:pPr>
+  </w:p>
+</w:ftr>
+</file>
+
+<file path=word/ftr-own2.xml><?xml version="1.0" encoding="utf-8"?>
+<w:ftr xmlns:w="http://schemas.openxmlformats.org/wordprocessingml/2006/main" xmlns:r="http://schemas.openxmlformats.org/officeDocument/2006/relationships">
+  <w:p>
+    <w:pPr>
+      <w:pStyle w:val="Footer"/>
+      <w:spacing w:before="0" w:after="0" w:line="320" w:lineRule="exact"/>
+      <w:ind w:left="0" w:firstLine="0"/>
+      <w:jc w:val="center"/>
+    </w:pPr>
+    <w:r>
+      <w:fldChar w:fldCharType="begin"/>
+    </w:r>
+    <w:r>
+      <w:instrText xml:space="preserve"> PAGE </w:instrText>
+    </w:r>
+    <w:r>
+      <w:fldChar w:fldCharType="separate"/>
+    </w:r>
+    <w:r>
+      <w:t>2</w:t>
+    </w:r>
+    <w:r>
+      <w:fldChar w:fldCharType="end"/>
+    </w:r>
+  </w:p>
+</w:ftr>
+</file>
+
+<file path=word/ftr-page.xml><?xml version="1.0" encoding="utf-8"?>
+<w:ftr xmlns:w="http://schemas.openxmlformats.org/wordprocessingml/2006/main" xmlns:r="http://schemas.openxmlformats.org/officeDocument/2006/relationships">
+  <w:p>
+    <w:pPr>
+      <w:spacing w:before="0" w:after="0"/>
+      <w:jc w:val="center"/>
+    </w:pPr>
+    <w:r>
+      <w:fldChar w:fldCharType="begin"/>
+    </w:r>
+    <w:r>
+      <w:instrText xml:space="preserve"> PAGE </w:instrText>
+    </w:r>
+    <w:r>
+      <w:fldChar w:fldCharType="separate"/>
+    </w:r>
+    <w:r>
+      <w:t>1</w:t>
+    </w:r>
+    <w:r>
+      <w:fldChar w:fldCharType="end"/>
+    </w:r>
+  </w:p>
+</w:ftr>
 </file>
 
 <file path=word/numbering.xml><?xml version="1.0" encoding="utf-8"?>
@@ -696,15 +694,16 @@
   <w:docDefaults>
     <w:rPrDefault>
       <w:rPr>
-        <w:rFonts w:ascii="EB Garamond" w:hAnsi="EB Garamond" w:eastAsia="EB Garamond" w:cs="EB Garamond"/>
-        <w:sz w:val="24"/>
-        <w:szCs w:val="24"/>
-        <w:lang w:val="en-US" w:eastAsia="zh-CN" w:bidi="ar-SA"/>
+        <w:rFonts w:ascii="Times New Roman" w:hAnsi="Times New Roman" w:eastAsia="Times New Roman" w:cs="Times New Roman"/>
+        <w:sz w:val="28"/>
+        <w:szCs w:val="28"/>
+        <w:lang w:val="en-US" w:eastAsia="en-US" w:bidi="ar-SA"/>
       </w:rPr>
     </w:rPrDefault>
     <w:pPrDefault>
       <w:pPr>
-        <w:spacing w:after="0" w:line="240" w:lineRule="auto"/>
+        <w:widowControl/>
+        <w:spacing w:before="0" w:after="0" w:line="320" w:lineRule="exact"/>
       </w:pPr>
     </w:pPrDefault>
   </w:docDefaults>
@@ -712,39 +711,29 @@
   <w:style w:type="paragraph" w:default="1" w:styleId="Normal">
     <w:name w:val="Normal"/>
     <w:qFormat/>
+    <w:pPr>
+      <w:spacing w:before="0" w:after="0" w:line="320" w:lineRule="exact"/>
+    </w:pPr>
   </w:style>
   <w:style w:type="paragraph" w:styleId="BodyText">
     <w:name w:val="Body Text"/>
     <w:basedOn w:val="Normal"/>
     <w:qFormat/>
     <w:pPr>
-      <w:spacing w:before="0" w:after="0" w:line="480" w:lineRule="auto"/>
+      <w:spacing w:before="0" w:after="0" w:line="656" w:lineRule="exact"/>
       <w:ind w:firstLine="720"/>
     </w:pPr>
-    <w:rPr>
-      <w:rFonts w:ascii="EB Garamond" w:hAnsi="EB Garamond" w:eastAsia="EB Garamond" w:cs="EB Garamond"/>
-      <w:sz w:val="24"/>
-      <w:szCs w:val="24"/>
-    </w:rPr>
   </w:style>
   <w:style w:type="paragraph" w:styleId="FirstParagraph">
     <w:name w:val="First Paragraph"/>
     <w:basedOn w:val="BodyText"/>
     <w:next w:val="BodyText"/>
     <w:qFormat/>
-    <w:pPr>
-      <w:spacing w:before="0" w:after="0" w:line="480" w:lineRule="auto"/>
-      <w:ind w:firstLine="720"/>
-    </w:pPr>
   </w:style>
   <w:style w:type="paragraph" w:styleId="Compact">
     <w:name w:val="Compact"/>
     <w:basedOn w:val="BodyText"/>
     <w:qFormat/>
-    <w:pPr>
-      <w:spacing w:before="0" w:after="0" w:line="480" w:lineRule="auto"/>
-      <w:ind w:firstLine="720"/>
-    </w:pPr>
   </w:style>
   <w:style w:type="paragraph" w:styleId="Title">
     <w:name w:val="Title"/>
@@ -760,7 +749,7 @@
       <w:jc w:val="center"/>
     </w:pPr>
     <w:rPr>
-      <w:rFonts w:asciiTheme="majorHAnsi" w:eastAsiaTheme="majorEastAsia" w:hAnsiTheme="majorHAnsi" w:cstheme="majorBidi"/>
+      <w:rFonts w:cstheme="majorBidi"/>
       <w:sz w:val="56"/>
       <w:szCs w:val="56"/>
     </w:rPr>
@@ -772,7 +761,7 @@
     <w:uiPriority w:val="10"/>
     <w:rsid w:val="00A10FD9"/>
     <w:rPr>
-      <w:rFonts w:asciiTheme="majorHAnsi" w:eastAsiaTheme="majorEastAsia" w:hAnsiTheme="majorHAnsi" w:cstheme="majorBidi"/>
+      <w:rFonts w:cstheme="majorBidi"/>
       <w:sz w:val="56"/>
       <w:szCs w:val="56"/>
     </w:rPr>
@@ -791,7 +780,7 @@
       </w:numPr>
     </w:pPr>
     <w:rPr>
-      <w:rFonts w:eastAsiaTheme="majorEastAsia" w:cstheme="majorBidi"/>
+      <w:rFonts w:cstheme="majorBidi"/>
       <w:spacing w:val="15"/>
       <w:sz w:val="28"/>
       <w:szCs w:val="28"/>
@@ -804,7 +793,7 @@
     <w:uiPriority w:val="11"/>
     <w:rsid w:val="00A10FD9"/>
     <w:rPr>
-      <w:rFonts w:eastAsiaTheme="majorEastAsia" w:cstheme="majorBidi"/>
+      <w:rFonts w:cstheme="majorBidi"/>
       <w:color w:val="595959" w:themeColor="text1" w:themeTint="A6"/>
       <w:spacing w:val="15"/>
       <w:sz w:val="28"/>
@@ -888,89 +877,56 @@
     <w:pPr>
       <w:keepNext/>
       <w:keepLines/>
-      <w:spacing w:before="240" w:after="240" w:line="240" w:lineRule="auto"/>
+      <w:spacing w:before="336" w:after="280" w:line="320" w:lineRule="exact"/>
       <w:ind w:firstLine="0"/>
       <w:jc w:val="center"/>
       <w:outlineLvl w:val="0"/>
     </w:pPr>
     <w:rPr>
-      <w:rFonts w:ascii="EB Garamond" w:hAnsi="EB Garamond" w:eastAsia="EB Garamond" w:cs="EB Garamond"/>
       <w:b/>
       <w:bCs/>
       <w:color w:val="000000"/>
-      <w:sz w:val="24"/>
-      <w:szCs w:val="24"/>
+      <w:sz w:val="28"/>
+      <w:szCs w:val="28"/>
     </w:rPr>
   </w:style>
   <w:style w:type="paragraph" w:styleId="Heading2">
     <w:name w:val="heading 2"/>
-    <w:basedOn w:val="Normal"/>
+    <w:basedOn w:val="Heading1"/>
     <w:next w:val="BodyText"/>
     <w:uiPriority w:val="9"/>
     <w:unhideWhenUsed/>
     <w:qFormat/>
     <w:pPr>
-      <w:keepNext/>
-      <w:keepLines/>
-      <w:spacing w:before="240" w:after="240" w:line="240" w:lineRule="auto"/>
-      <w:ind w:left="720" w:hanging="720" w:firstLine="0"/>
+      <w:jc w:val="left"/>
       <w:outlineLvl w:val="1"/>
     </w:pPr>
-    <w:rPr>
-      <w:rFonts w:ascii="EB Garamond" w:hAnsi="EB Garamond" w:eastAsia="EB Garamond" w:cs="EB Garamond"/>
-      <w:b/>
-      <w:bCs/>
-      <w:color w:val="000000"/>
-      <w:sz w:val="24"/>
-      <w:szCs w:val="24"/>
-    </w:rPr>
   </w:style>
   <w:style w:type="paragraph" w:styleId="Heading3">
     <w:name w:val="heading 3"/>
-    <w:basedOn w:val="Normal"/>
+    <w:basedOn w:val="Heading1"/>
     <w:next w:val="BodyText"/>
     <w:uiPriority w:val="9"/>
     <w:unhideWhenUsed/>
     <w:qFormat/>
     <w:pPr>
-      <w:keepNext/>
-      <w:keepLines/>
-      <w:spacing w:before="120" w:after="120" w:line="240" w:lineRule="auto"/>
-      <w:ind w:left="720" w:firstLine="0"/>
+      <w:spacing w:before="280" w:after="224" w:line="320" w:lineRule="exact"/>
       <w:outlineLvl w:val="2"/>
     </w:pPr>
-    <w:rPr>
-      <w:rFonts w:ascii="EB Garamond" w:hAnsi="EB Garamond" w:eastAsia="EB Garamond" w:cs="EB Garamond"/>
-      <w:b/>
-      <w:bCs/>
-      <w:i/>
-      <w:iCs/>
-      <w:color w:val="000000"/>
-      <w:sz w:val="24"/>
-      <w:szCs w:val="24"/>
-    </w:rPr>
   </w:style>
   <w:style w:type="paragraph" w:styleId="Heading4">
     <w:name w:val="heading 4"/>
-    <w:basedOn w:val="Normal"/>
+    <w:basedOn w:val="Heading3"/>
     <w:next w:val="BodyText"/>
-    <w:link w:val="Heading4Char"/>
-    <w:uiPriority w:val="9"/>
-    <w:semiHidden/>
+    <w:uiPriority w:val="9"/>
     <w:unhideWhenUsed/>
     <w:qFormat/>
-    <w:rsid w:val="00A10FD9"/>
-    <w:pPr>
-      <w:keepNext/>
-      <w:keepLines/>
-      <w:spacing w:before="80" w:after="40"/>
+    <w:pPr>
       <w:outlineLvl w:val="3"/>
     </w:pPr>
     <w:rPr>
-      <w:rFonts w:eastAsiaTheme="majorEastAsia" w:cstheme="majorBidi"/>
-      <w:i/>
-      <w:iCs/>
-      <w:color w:val="0F4761" w:themeColor="accent1" w:themeShade="BF"/>
+      <w:i w:val="0"/>
+      <w:iCs w:val="0"/>
     </w:rPr>
   </w:style>
   <w:style w:type="paragraph" w:styleId="Heading5">
@@ -990,7 +946,7 @@
       <w:outlineLvl w:val="4"/>
     </w:pPr>
     <w:rPr>
-      <w:rFonts w:eastAsiaTheme="majorEastAsia" w:cstheme="majorBidi"/>
+      <w:rFonts w:cstheme="majorBidi"/>
       <w:color w:val="0F4761" w:themeColor="accent1" w:themeShade="BF"/>
     </w:rPr>
   </w:style>
@@ -1011,7 +967,7 @@
       <w:outlineLvl w:val="5"/>
     </w:pPr>
     <w:rPr>
-      <w:rFonts w:eastAsiaTheme="majorEastAsia" w:cstheme="majorBidi"/>
+      <w:rFonts w:cstheme="majorBidi"/>
       <w:i/>
       <w:iCs/>
       <w:color w:val="595959" w:themeColor="text1" w:themeTint="A6"/>
@@ -1034,7 +990,7 @@
       <w:outlineLvl w:val="6"/>
     </w:pPr>
     <w:rPr>
-      <w:rFonts w:eastAsiaTheme="majorEastAsia" w:cstheme="majorBidi"/>
+      <w:rFonts w:cstheme="majorBidi"/>
       <w:color w:val="595959" w:themeColor="text1" w:themeTint="A6"/>
     </w:rPr>
   </w:style>
@@ -1055,7 +1011,7 @@
       <w:outlineLvl w:val="7"/>
     </w:pPr>
     <w:rPr>
-      <w:rFonts w:eastAsiaTheme="majorEastAsia" w:cstheme="majorBidi"/>
+      <w:rFonts w:cstheme="majorBidi"/>
       <w:i/>
       <w:iCs/>
       <w:color w:val="272727" w:themeColor="text1" w:themeTint="D8"/>
@@ -1078,7 +1034,7 @@
       <w:outlineLvl w:val="8"/>
     </w:pPr>
     <w:rPr>
-      <w:rFonts w:eastAsiaTheme="majorEastAsia" w:cstheme="majorBidi"/>
+      <w:rFonts w:cstheme="majorBidi"/>
       <w:color w:val="272727" w:themeColor="text1" w:themeTint="D8"/>
     </w:rPr>
   </w:style>
@@ -1089,7 +1045,7 @@
     <w:uiPriority w:val="9"/>
     <w:rsid w:val="00A10FD9"/>
     <w:rPr>
-      <w:rFonts w:asciiTheme="majorHAnsi" w:eastAsiaTheme="majorEastAsia" w:hAnsiTheme="majorHAnsi" w:cstheme="majorBidi"/>
+      <w:rFonts w:cstheme="majorBidi"/>
       <w:color w:val="0F4761" w:themeColor="accent1" w:themeShade="BF"/>
       <w:sz w:val="40"/>
       <w:szCs w:val="40"/>
@@ -1103,7 +1059,7 @@
     <w:semiHidden/>
     <w:rsid w:val="00A10FD9"/>
     <w:rPr>
-      <w:rFonts w:asciiTheme="majorHAnsi" w:eastAsiaTheme="majorEastAsia" w:hAnsiTheme="majorHAnsi" w:cstheme="majorBidi"/>
+      <w:rFonts w:cstheme="majorBidi"/>
       <w:color w:val="0F4761" w:themeColor="accent1" w:themeShade="BF"/>
       <w:sz w:val="32"/>
       <w:szCs w:val="32"/>
@@ -1117,7 +1073,7 @@
     <w:semiHidden/>
     <w:rsid w:val="00A10FD9"/>
     <w:rPr>
-      <w:rFonts w:eastAsiaTheme="majorEastAsia" w:cstheme="majorBidi"/>
+      <w:rFonts w:cstheme="majorBidi"/>
       <w:color w:val="0F4761" w:themeColor="accent1" w:themeShade="BF"/>
       <w:sz w:val="28"/>
       <w:szCs w:val="28"/>
@@ -1131,7 +1087,7 @@
     <w:semiHidden/>
     <w:rsid w:val="00A10FD9"/>
     <w:rPr>
-      <w:rFonts w:eastAsiaTheme="majorEastAsia" w:cstheme="majorBidi"/>
+      <w:rFonts w:cstheme="majorBidi"/>
       <w:i/>
       <w:iCs/>
       <w:color w:val="0F4761" w:themeColor="accent1" w:themeShade="BF"/>
@@ -1145,7 +1101,7 @@
     <w:semiHidden/>
     <w:rsid w:val="00A10FD9"/>
     <w:rPr>
-      <w:rFonts w:eastAsiaTheme="majorEastAsia" w:cstheme="majorBidi"/>
+      <w:rFonts w:cstheme="majorBidi"/>
       <w:color w:val="0F4761" w:themeColor="accent1" w:themeShade="BF"/>
     </w:rPr>
   </w:style>
@@ -1157,7 +1113,7 @@
     <w:semiHidden/>
     <w:rsid w:val="00A10FD9"/>
     <w:rPr>
-      <w:rFonts w:eastAsiaTheme="majorEastAsia" w:cstheme="majorBidi"/>
+      <w:rFonts w:cstheme="majorBidi"/>
       <w:i/>
       <w:iCs/>
       <w:color w:val="595959" w:themeColor="text1" w:themeTint="A6"/>
@@ -1171,7 +1127,7 @@
     <w:semiHidden/>
     <w:rsid w:val="00A10FD9"/>
     <w:rPr>
-      <w:rFonts w:eastAsiaTheme="majorEastAsia" w:cstheme="majorBidi"/>
+      <w:rFonts w:cstheme="majorBidi"/>
       <w:color w:val="595959" w:themeColor="text1" w:themeTint="A6"/>
     </w:rPr>
   </w:style>
@@ -1183,7 +1139,7 @@
     <w:semiHidden/>
     <w:rsid w:val="00A10FD9"/>
     <w:rPr>
-      <w:rFonts w:eastAsiaTheme="majorEastAsia" w:cstheme="majorBidi"/>
+      <w:rFonts w:cstheme="majorBidi"/>
       <w:i/>
       <w:iCs/>
       <w:color w:val="272727" w:themeColor="text1" w:themeTint="D8"/>
@@ -1197,17 +1153,17 @@
     <w:semiHidden/>
     <w:rsid w:val="00A10FD9"/>
     <w:rPr>
-      <w:rFonts w:eastAsiaTheme="majorEastAsia" w:cstheme="majorBidi"/>
+      <w:rFonts w:cstheme="majorBidi"/>
       <w:color w:val="272727" w:themeColor="text1" w:themeTint="D8"/>
     </w:rPr>
   </w:style>
   <w:style w:type="paragraph" w:styleId="BlockText">
     <w:name w:val="Block Text"/>
-    <w:basedOn w:val="BodyText"/>
+    <w:basedOn w:val="Normal"/>
     <w:next w:val="BodyText"/>
     <w:qFormat/>
     <w:pPr>
-      <w:spacing w:before="0" w:after="240" w:line="240" w:lineRule="auto"/>
+      <w:spacing w:before="252" w:after="252" w:line="320" w:lineRule="exact"/>
       <w:ind w:left="720" w:right="720" w:firstLine="0"/>
     </w:pPr>
   </w:style>
@@ -1216,14 +1172,14 @@
     <w:basedOn w:val="Normal"/>
     <w:uiPriority w:val="9"/>
     <w:unhideWhenUsed/>
-    <w:pPr>
-      <w:spacing w:before="0" w:after="120" w:line="240" w:lineRule="auto"/>
+    <w:qFormat/>
+    <w:pPr>
+      <w:spacing w:before="0" w:after="140" w:line="320" w:lineRule="exact"/>
       <w:ind w:firstLine="0"/>
     </w:pPr>
     <w:rPr>
-      <w:rFonts w:ascii="EB Garamond" w:hAnsi="EB Garamond" w:eastAsia="EB Garamond" w:cs="EB Garamond"/>
-      <w:sz w:val="24"/>
-      <w:szCs w:val="24"/>
+      <w:sz w:val="28"/>
+      <w:szCs w:val="28"/>
     </w:rPr>
   </w:style>
   <w:style w:type="paragraph" w:styleId="FootnoteBlockText">
@@ -1334,16 +1290,16 @@
   </w:style>
   <w:style w:type="character" w:styleId="FootnoteReference">
     <w:name w:val="Footnote Reference"/>
-    <w:basedOn w:val="BodyTextChar"/>
+    <w:basedOn w:val="DefaultParagraphFont"/>
     <w:rPr>
       <w:vertAlign w:val="superscript"/>
     </w:rPr>
   </w:style>
   <w:style w:type="character" w:styleId="Hyperlink">
     <w:name w:val="Hyperlink"/>
-    <w:basedOn w:val="BodyTextChar"/>
-    <w:rPr>
-      <w:color w:val="4F81BD" w:themeColor="accent1"/>
+    <w:basedOn w:val="DefaultParagraphFont"/>
+    <w:rPr>
+      <w:color w:val="000000"/>
     </w:rPr>
   </w:style>
   <w:style w:type="paragraph" w:styleId="TOCHeading">
@@ -1358,14 +1314,14 @@
       <w:outlineLvl w:val="9"/>
     </w:pPr>
     <w:rPr>
-      <w:rFonts w:asciiTheme="majorHAnsi" w:eastAsiaTheme="majorEastAsia" w:hAnsiTheme="majorHAnsi" w:cstheme="majorBidi"/>
+      <w:rFonts w:cstheme="majorBidi"/>
       <w:b w:val="0"/>
       <w:bCs w:val="0"/>
       <w:color w:val="365F91" w:themeColor="accent1" w:themeShade="BF"/>
     </w:rPr>
   </w:style>
-  <w:style w:type="paragraph" w:customStyle="1" w:styleId="BodyKeepNext">
-    <w:name w:val="Body Keep Next"/>
+  <w:style w:type="paragraph" w:customStyle="1" w:styleId="BodyKeep">
+    <w:name w:val="Body Keep"/>
     <w:basedOn w:val="BodyText"/>
     <w:qFormat/>
     <w:pPr>
@@ -1373,42 +1329,20 @@
       <w:keepLines/>
     </w:pPr>
   </w:style>
-  <w:style w:type="paragraph" w:customStyle="1" w:styleId="Centered">
-    <w:name w:val="Centered"/>
+  <w:style w:type="paragraph" w:customStyle="1" w:styleId="BlockTextLast">
+    <w:name w:val="Block Text Last"/>
+    <w:basedOn w:val="BlockText"/>
+    <w:next w:val="BodyText"/>
+    <w:qFormat/>
+    <w:pPr>
+      <w:spacing w:before="252" w:after="392" w:line="320" w:lineRule="exact"/>
+    </w:pPr>
+  </w:style>
+  <w:style w:type="paragraph" w:styleId="Footer">
+    <w:name w:val="footer"/>
     <w:basedOn w:val="Normal"/>
-    <w:qFormat/>
-    <w:pPr>
-      <w:spacing w:before="0" w:after="0" w:line="240" w:lineRule="auto"/>
-      <w:ind w:firstLine="0"/>
-      <w:jc w:val="center"/>
-    </w:pPr>
-  </w:style>
-  <w:style w:type="paragraph" w:customStyle="1" w:styleId="CoverLine">
-    <w:name w:val="CoverLine"/>
-    <w:basedOn w:val="Normal"/>
-    <w:qFormat/>
-    <w:pPr>
-      <w:spacing w:before="0" w:after="60" w:line="240" w:lineRule="auto"/>
-      <w:ind w:firstLine="0"/>
-    </w:pPr>
-  </w:style>
-  <w:style w:type="paragraph" w:customStyle="1" w:styleId="SigBlock">
-    <w:name w:val="SigBlock"/>
-    <w:basedOn w:val="Normal"/>
-    <w:qFormat/>
-    <w:pPr>
-      <w:keepLines/>
-      <w:spacing w:before="0" w:after="0" w:line="240" w:lineRule="auto"/>
-      <w:ind w:left="4320" w:firstLine="0"/>
-    </w:pPr>
-  </w:style>
-  <w:style w:type="paragraph" w:customStyle="1" w:styleId="Single">
-    <w:name w:val="Single"/>
-    <w:basedOn w:val="Normal"/>
-    <w:qFormat/>
-    <w:pPr>
-      <w:spacing w:before="0" w:after="180" w:line="240" w:lineRule="auto"/>
-      <w:ind w:firstLine="0"/>
+    <w:pPr>
+      <w:spacing w:before="0" w:after="0" w:line="320" w:lineRule="exact"/>
     </w:pPr>
   </w:style>
   <w:style w:type="paragraph" w:customStyle="1" w:styleId="SourceCode">
@@ -1691,7 +1625,7 @@
     </a:clrScheme>
     <a:fontScheme name="Office">
       <a:majorFont>
-        <a:latin typeface="Aptos Display" panose="02110004020202020204"/>
+        <a:latin typeface="Times New Roman" panose="02110004020202020204"/>
         <a:ea typeface=""/>
         <a:cs typeface=""/>
         <a:font script="Jpan" typeface="游ゴシック Light"/>
@@ -1743,7 +1677,7 @@
         <a:font script="Tfng" typeface="Ebrima"/>
       </a:majorFont>
       <a:minorFont>
-        <a:latin typeface="Aptos" panose="02110004020202020204"/>
+        <a:latin typeface="Times New Roman" panose="02110004020202020204"/>
         <a:ea typeface=""/>
         <a:cs typeface=""/>
         <a:font script="Jpan" typeface="游明朝"/>

</xml_diff>